<commit_message>
corregir typos en plantillas para documentos
</commit_message>
<xml_diff>
--- a/public/plantillas/confirmacion.docx
+++ b/public/plantillas/confirmacion.docx
@@ -448,14 +448,14 @@
         <w:rPr>
           <w:sz w:val="28"/>
         </w:rPr>
-        <w:t xml:space="preserve">Que en el libro ${numero_libro} de Confirmación  ${numero_pagina} y bajo el N° Marginal </w:t>
-      </w:r>
-      <w:r>
-        <w:rPr>
-          <w:sz w:val="28"/>
-          <w:u w:val="thick"/>
-        </w:rPr>
-        <w:t xml:space="preserve"> </w:t>
+        <w:t>Que en el libro ${numero_libro} de Confirmación ${numero_pagina} y bajo el N° Margina</w:t>
+      </w:r>
+      <w:r>
+        <w:rPr>
+          <w:sz w:val="28"/>
+          <w:u w:val="none"/>
+        </w:rPr>
+        <w:t xml:space="preserve">l </w:t>
       </w:r>
       <w:r>
         <w:rPr>
@@ -581,31 +581,7 @@
         <w:rPr>
           <w:sz w:val="28"/>
         </w:rPr>
-        <w:t>Hijo</w:t>
-      </w:r>
-      <w:r>
-        <w:rPr>
-          <w:sz w:val="28"/>
-        </w:rPr>
-        <w:t>(</w:t>
-      </w:r>
-      <w:r>
-        <w:rPr>
-          <w:sz w:val="28"/>
-        </w:rPr>
-        <w:t>a</w:t>
-      </w:r>
-      <w:r>
-        <w:rPr>
-          <w:sz w:val="28"/>
-        </w:rPr>
-        <w:t>)</w:t>
-      </w:r>
-      <w:r>
-        <w:rPr>
-          <w:sz w:val="28"/>
-        </w:rPr>
-        <w:t xml:space="preserve"> de: ${padre_1</w:t>
+        <w:t>Hijo(a) de: ${padre_1</w:t>
       </w:r>
       <w:r>
         <w:rPr>

</xml_diff>